<commit_message>
docs(battle): align submission artifacts with early judging
Document the both-accepted early JUDGING transition from PR #98 and
regenerate the Markdown-source-aligned submission artifacts for issue #94.
</commit_message>
<xml_diff>
--- a/submission/D3_업무흐름도.docx
+++ b/submission/D3_업무흐름도.docx
@@ -219,7 +219,7 @@
                 <w:rFonts w:ascii="Apple SD Gothic Neo" w:hAnsi="Apple SD Gothic Neo" w:eastAsia="Apple SD Gothic Neo" w:cs="Apple SD Gothic Neo"/>
                 <w:sz w:val="18"/>
               </w:rPr>
-              <w:t>1afdd16 (main)</w:t>
+              <w:t>ab71e2b (main)</w:t>
             </w:r>
           </w:p>
         </w:tc>
@@ -1414,7 +1414,7 @@
           <w:rFonts w:ascii="Apple SD Gothic Neo" w:hAnsi="Apple SD Gothic Neo" w:eastAsia="Apple SD Gothic Neo" w:cs="Apple SD Gothic Neo"/>
           <w:sz w:val="21"/>
         </w:rPr>
-        <w:t>현재 구현에서는 한쪽 또는 양쪽 플레이어가 Submit을 눌러도 매치가 즉시 끝나지 않는다. Submit은 Judge 증거를 기록하며, 서버가 가진 매치 타이머가 만료되면 Battle이 RUNNING에서 JUDGING으로 전환한 뒤 저장된 증거를 비교하여 FINISHED를 확정한다.</w:t>
+        <w:t>Submit은 Judge 증거를 기록하며, ACCEPTED된 제출은 해당 플레이어만 잠근다. 양쪽 플레이어가 모두 ACCEPTED되면 Battle은 즉시 RUNNING에서 JUDGING으로 전환해 결과 계산을 시작한다. 한쪽만 ACCEPTED이거나 미정답이면 서버 매치 타이머 만료 후 저장된 증거를 비교하여 FINISHED를 확정한다.</w:t>
       </w:r>
     </w:p>
     <w:p>

</xml_diff>